<commit_message>
fix(docx): rebuild dynamic TOC field so WPS no longer hits stale bookmarks
The source template's TOC field cached three hardcoded zone entries
(3.1 I区/3.2 II区/3.3 III区) whose PAGEREF targets were deleted once zones
became a Jinja loop, so WPS reported '错误！未定义书签' on refresh.

- prototype.rebuild_toc_field strips the TOC field's cached result, keeping the
  begin/instr/separate ... end skeleton with a hint run; Word/WPS rebuilds the
  entries from the live Heading paragraphs on open (updateFields already set).
- check_structure relaxes the field gate: stable fields (PAGE/STYLEREF/REF)
  must stay identical, the document must still keep exactly one TOC field.
- Regenerate the frozen template and fake report: PAGEREF=0, no missing
  bookmarks, no residual XX/Jinja in rendered output.
</commit_message>
<xml_diff>
--- a/tools/docx-render/templates/project-report.docx
+++ b/tools/docx-render/templates/project-report.docx
@@ -372,613 +372,13 @@
         <w:fldChar w:fldCharType="begin"/>
       </w:r>
       <w:r>
-        <w:instrText xml:space="preserve">TOC \o "1-2" \h \u </w:instrText>
+        <w:instrText xml:space="preserve"> TOC \o "1-2" \h \u </w:instrText>
       </w:r>
       <w:r>
         <w:fldChar w:fldCharType="separate"/>
       </w:r>
       <w:r>
-        <w:fldChar w:fldCharType="begin"/>
-      </w:r>
-      <w:r>
-        <w:instrText xml:space="preserve"> HYPERLINK \l _Toc9875 </w:instrText>
-      </w:r>
-      <w:r>
-        <w:fldChar w:fldCharType="separate"/>
-      </w:r>
-      <w:r>
-        <w:rPr>
-          <w:rFonts w:hint="eastAsia"/>
-        </w:rPr>
-        <w:t>1 概述</w:t>
-      </w:r>
-      <w:r>
-        <w:tab/>
-      </w:r>
-      <w:r>
-        <w:fldChar w:fldCharType="begin"/>
-      </w:r>
-      <w:r>
-        <w:instrText xml:space="preserve"> PAGEREF _Toc9875 </w:instrText>
-      </w:r>
-      <w:r>
-        <w:fldChar w:fldCharType="separate"/>
-      </w:r>
-      <w:r>
-        <w:t>1</w:t>
-      </w:r>
-      <w:r>
-        <w:fldChar w:fldCharType="end"/>
-      </w:r>
-      <w:r>
-        <w:fldChar w:fldCharType="end"/>
-      </w:r>
-    </w:p>
-    <w:p>
-      <w:pPr>
-        <w:pStyle w:val="15"/>
-        <w:keepNext w:val="0"/>
-        <w:keepLines w:val="0"/>
-        <w:pageBreakBefore w:val="0"/>
-        <w:widowControl w:val="0"/>
-        <w:tabs>
-          <w:tab w:val="right" w:leader="dot" w:pos="8504"/>
-        </w:tabs>
-        <w:kinsoku/>
-        <w:wordWrap/>
-        <w:overflowPunct/>
-        <w:topLinePunct w:val="0"/>
-        <w:autoSpaceDE/>
-        <w:autoSpaceDN/>
-        <w:bidi w:val="0"/>
-        <w:adjustRightInd/>
-        <w:snapToGrid/>
-        <w:ind w:firstLine="0" w:firstLineChars="0"/>
-        <w:textAlignment w:val="auto"/>
-      </w:pPr>
-      <w:r>
-        <w:fldChar w:fldCharType="begin"/>
-      </w:r>
-      <w:r>
-        <w:instrText xml:space="preserve"> HYPERLINK \l _Toc27464 </w:instrText>
-      </w:r>
-      <w:r>
-        <w:fldChar w:fldCharType="separate"/>
-      </w:r>
-      <w:r>
-        <w:rPr>
-          <w:rFonts w:hint="eastAsia"/>
-        </w:rPr>
-        <w:t>2 测试过程及方法</w:t>
-      </w:r>
-      <w:r>
-        <w:tab/>
-      </w:r>
-      <w:r>
-        <w:fldChar w:fldCharType="begin"/>
-      </w:r>
-      <w:r>
-        <w:instrText xml:space="preserve"> PAGEREF _Toc27464 </w:instrText>
-      </w:r>
-      <w:r>
-        <w:fldChar w:fldCharType="separate"/>
-      </w:r>
-      <w:r>
-        <w:t>1</w:t>
-      </w:r>
-      <w:r>
-        <w:fldChar w:fldCharType="end"/>
-      </w:r>
-      <w:r>
-        <w:fldChar w:fldCharType="end"/>
-      </w:r>
-    </w:p>
-    <w:p>
-      <w:pPr>
-        <w:pStyle w:val="16"/>
-        <w:keepNext w:val="0"/>
-        <w:keepLines w:val="0"/>
-        <w:pageBreakBefore w:val="0"/>
-        <w:widowControl w:val="0"/>
-        <w:tabs>
-          <w:tab w:val="right" w:leader="dot" w:pos="8504"/>
-        </w:tabs>
-        <w:kinsoku/>
-        <w:wordWrap/>
-        <w:overflowPunct/>
-        <w:topLinePunct w:val="0"/>
-        <w:autoSpaceDE/>
-        <w:autoSpaceDN/>
-        <w:bidi w:val="0"/>
-        <w:adjustRightInd/>
-        <w:snapToGrid/>
-        <w:ind w:firstLine="0" w:firstLineChars="0"/>
-        <w:textAlignment w:val="auto"/>
-      </w:pPr>
-      <w:r>
-        <w:fldChar w:fldCharType="begin"/>
-      </w:r>
-      <w:r>
-        <w:instrText xml:space="preserve"> HYPERLINK \l _Toc25709 </w:instrText>
-      </w:r>
-      <w:r>
-        <w:fldChar w:fldCharType="separate"/>
-      </w:r>
-      <w:r>
-        <w:rPr>
-          <w:rFonts w:hint="eastAsia"/>
-        </w:rPr>
-        <w:t>2.1 渗透测试概念</w:t>
-      </w:r>
-      <w:r>
-        <w:tab/>
-      </w:r>
-      <w:r>
-        <w:fldChar w:fldCharType="begin"/>
-      </w:r>
-      <w:r>
-        <w:instrText xml:space="preserve"> PAGEREF _Toc25709 </w:instrText>
-      </w:r>
-      <w:r>
-        <w:fldChar w:fldCharType="separate"/>
-      </w:r>
-      <w:r>
-        <w:t>1</w:t>
-      </w:r>
-      <w:r>
-        <w:fldChar w:fldCharType="end"/>
-      </w:r>
-      <w:r>
-        <w:fldChar w:fldCharType="end"/>
-      </w:r>
-    </w:p>
-    <w:p>
-      <w:pPr>
-        <w:pStyle w:val="16"/>
-        <w:keepNext w:val="0"/>
-        <w:keepLines w:val="0"/>
-        <w:pageBreakBefore w:val="0"/>
-        <w:widowControl w:val="0"/>
-        <w:tabs>
-          <w:tab w:val="right" w:leader="dot" w:pos="8504"/>
-        </w:tabs>
-        <w:kinsoku/>
-        <w:wordWrap/>
-        <w:overflowPunct/>
-        <w:topLinePunct w:val="0"/>
-        <w:autoSpaceDE/>
-        <w:autoSpaceDN/>
-        <w:bidi w:val="0"/>
-        <w:adjustRightInd/>
-        <w:snapToGrid/>
-        <w:ind w:firstLine="0" w:firstLineChars="0"/>
-        <w:textAlignment w:val="auto"/>
-      </w:pPr>
-      <w:r>
-        <w:fldChar w:fldCharType="begin"/>
-      </w:r>
-      <w:r>
-        <w:instrText xml:space="preserve"> HYPERLINK \l _Toc31840 </w:instrText>
-      </w:r>
-      <w:r>
-        <w:fldChar w:fldCharType="separate"/>
-      </w:r>
-      <w:r>
-        <w:rPr>
-          <w:rFonts w:hint="eastAsia"/>
-        </w:rPr>
-        <w:t>2.2 使用工具介绍</w:t>
-      </w:r>
-      <w:r>
-        <w:tab/>
-      </w:r>
-      <w:r>
-        <w:fldChar w:fldCharType="begin"/>
-      </w:r>
-      <w:r>
-        <w:instrText xml:space="preserve"> PAGEREF _Toc31840 </w:instrText>
-      </w:r>
-      <w:r>
-        <w:fldChar w:fldCharType="separate"/>
-      </w:r>
-      <w:r>
-        <w:t>1</w:t>
-      </w:r>
-      <w:r>
-        <w:fldChar w:fldCharType="end"/>
-      </w:r>
-      <w:r>
-        <w:fldChar w:fldCharType="end"/>
-      </w:r>
-    </w:p>
-    <w:p>
-      <w:pPr>
-        <w:pStyle w:val="16"/>
-        <w:keepNext w:val="0"/>
-        <w:keepLines w:val="0"/>
-        <w:pageBreakBefore w:val="0"/>
-        <w:widowControl w:val="0"/>
-        <w:tabs>
-          <w:tab w:val="right" w:leader="dot" w:pos="8504"/>
-        </w:tabs>
-        <w:kinsoku/>
-        <w:wordWrap/>
-        <w:overflowPunct/>
-        <w:topLinePunct w:val="0"/>
-        <w:autoSpaceDE/>
-        <w:autoSpaceDN/>
-        <w:bidi w:val="0"/>
-        <w:adjustRightInd/>
-        <w:snapToGrid/>
-        <w:ind w:firstLine="0" w:firstLineChars="0"/>
-        <w:textAlignment w:val="auto"/>
-      </w:pPr>
-      <w:r>
-        <w:fldChar w:fldCharType="begin"/>
-      </w:r>
-      <w:r>
-        <w:instrText xml:space="preserve"> HYPERLINK \l _Toc24274 </w:instrText>
-      </w:r>
-      <w:r>
-        <w:fldChar w:fldCharType="separate"/>
-      </w:r>
-      <w:r>
-        <w:rPr>
-          <w:rFonts w:hint="eastAsia"/>
-        </w:rPr>
-        <w:t>2.3 测试过程介绍</w:t>
-      </w:r>
-      <w:r>
-        <w:tab/>
-      </w:r>
-      <w:r>
-        <w:fldChar w:fldCharType="begin"/>
-      </w:r>
-      <w:r>
-        <w:instrText xml:space="preserve"> PAGEREF _Toc24274 </w:instrText>
-      </w:r>
-      <w:r>
-        <w:fldChar w:fldCharType="separate"/>
-      </w:r>
-      <w:r>
-        <w:t>3</w:t>
-      </w:r>
-      <w:r>
-        <w:fldChar w:fldCharType="end"/>
-      </w:r>
-      <w:r>
-        <w:fldChar w:fldCharType="end"/>
-      </w:r>
-    </w:p>
-    <w:p>
-      <w:pPr>
-        <w:pStyle w:val="15"/>
-        <w:keepNext w:val="0"/>
-        <w:keepLines w:val="0"/>
-        <w:pageBreakBefore w:val="0"/>
-        <w:widowControl w:val="0"/>
-        <w:tabs>
-          <w:tab w:val="right" w:leader="dot" w:pos="8504"/>
-        </w:tabs>
-        <w:kinsoku/>
-        <w:wordWrap/>
-        <w:overflowPunct/>
-        <w:topLinePunct w:val="0"/>
-        <w:autoSpaceDE/>
-        <w:autoSpaceDN/>
-        <w:bidi w:val="0"/>
-        <w:adjustRightInd/>
-        <w:snapToGrid/>
-        <w:ind w:firstLine="0" w:firstLineChars="0"/>
-        <w:textAlignment w:val="auto"/>
-      </w:pPr>
-      <w:r>
-        <w:fldChar w:fldCharType="begin"/>
-      </w:r>
-      <w:r>
-        <w:instrText xml:space="preserve"> HYPERLINK \l _Toc23377 </w:instrText>
-      </w:r>
-      <w:r>
-        <w:fldChar w:fldCharType="separate"/>
-      </w:r>
-      <w:r>
-        <w:rPr>
-          <w:rFonts w:hint="eastAsia"/>
-        </w:rPr>
-        <w:t>3 测试结果与分析</w:t>
-      </w:r>
-      <w:r>
-        <w:tab/>
-      </w:r>
-      <w:r>
-        <w:fldChar w:fldCharType="begin"/>
-      </w:r>
-      <w:r>
-        <w:instrText xml:space="preserve"> PAGEREF _Toc23377 </w:instrText>
-      </w:r>
-      <w:r>
-        <w:fldChar w:fldCharType="separate"/>
-      </w:r>
-      <w:r>
-        <w:t>4</w:t>
-      </w:r>
-      <w:r>
-        <w:fldChar w:fldCharType="end"/>
-      </w:r>
-      <w:r>
-        <w:fldChar w:fldCharType="end"/>
-      </w:r>
-    </w:p>
-    <w:p>
-      <w:pPr>
-        <w:pStyle w:val="16"/>
-        <w:keepNext w:val="0"/>
-        <w:keepLines w:val="0"/>
-        <w:pageBreakBefore w:val="0"/>
-        <w:widowControl w:val="0"/>
-        <w:tabs>
-          <w:tab w:val="right" w:leader="dot" w:pos="8504"/>
-        </w:tabs>
-        <w:kinsoku/>
-        <w:wordWrap/>
-        <w:overflowPunct/>
-        <w:topLinePunct w:val="0"/>
-        <w:autoSpaceDE/>
-        <w:autoSpaceDN/>
-        <w:bidi w:val="0"/>
-        <w:adjustRightInd/>
-        <w:snapToGrid/>
-        <w:ind w:firstLine="0" w:firstLineChars="0"/>
-        <w:textAlignment w:val="auto"/>
-      </w:pPr>
-      <w:r>
-        <w:fldChar w:fldCharType="begin"/>
-      </w:r>
-      <w:r>
-        <w:instrText xml:space="preserve"> HYPERLINK \l _Toc21060 </w:instrText>
-      </w:r>
-      <w:r>
-        <w:fldChar w:fldCharType="separate"/>
-      </w:r>
-      <w:r>
-        <w:rPr>
-          <w:rFonts w:hint="eastAsia"/>
-        </w:rPr>
-        <w:t xml:space="preserve">3.1 </w:t>
-      </w:r>
-      <w:r>
-        <w:rPr>
-          <w:rFonts w:ascii="Cambria" w:hAnsi="Cambria"/>
-        </w:rPr>
-        <w:t>I</w:t>
-      </w:r>
-      <w:r>
-        <w:rPr>
-          <w:rFonts w:hint="eastAsia"/>
-        </w:rPr>
-        <w:t>区</w:t>
-      </w:r>
-      <w:r>
-        <w:tab/>
-      </w:r>
-      <w:r>
-        <w:fldChar w:fldCharType="begin"/>
-      </w:r>
-      <w:r>
-        <w:instrText xml:space="preserve"> PAGEREF _Toc21060 </w:instrText>
-      </w:r>
-      <w:r>
-        <w:fldChar w:fldCharType="separate"/>
-      </w:r>
-      <w:r>
-        <w:t>4</w:t>
-      </w:r>
-      <w:r>
-        <w:fldChar w:fldCharType="end"/>
-      </w:r>
-      <w:r>
-        <w:fldChar w:fldCharType="end"/>
-      </w:r>
-    </w:p>
-    <w:p>
-      <w:pPr>
-        <w:pStyle w:val="16"/>
-        <w:keepNext w:val="0"/>
-        <w:keepLines w:val="0"/>
-        <w:pageBreakBefore w:val="0"/>
-        <w:widowControl w:val="0"/>
-        <w:tabs>
-          <w:tab w:val="right" w:leader="dot" w:pos="8504"/>
-        </w:tabs>
-        <w:kinsoku/>
-        <w:wordWrap/>
-        <w:overflowPunct/>
-        <w:topLinePunct w:val="0"/>
-        <w:autoSpaceDE/>
-        <w:autoSpaceDN/>
-        <w:bidi w:val="0"/>
-        <w:adjustRightInd/>
-        <w:snapToGrid/>
-        <w:ind w:firstLine="0" w:firstLineChars="0"/>
-        <w:textAlignment w:val="auto"/>
-      </w:pPr>
-      <w:r>
-        <w:fldChar w:fldCharType="begin"/>
-      </w:r>
-      <w:r>
-        <w:instrText xml:space="preserve"> HYPERLINK \l _Toc24649 </w:instrText>
-      </w:r>
-      <w:r>
-        <w:fldChar w:fldCharType="separate"/>
-      </w:r>
-      <w:r>
-        <w:rPr>
-          <w:rFonts w:hint="eastAsia"/>
-        </w:rPr>
-        <w:t xml:space="preserve">3.2 </w:t>
-      </w:r>
-      <w:r>
-        <w:rPr>
-          <w:rFonts w:ascii="Cambria" w:hAnsi="Cambria"/>
-        </w:rPr>
-        <w:t>II</w:t>
-      </w:r>
-      <w:r>
-        <w:rPr>
-          <w:rFonts w:hint="eastAsia"/>
-        </w:rPr>
-        <w:t>区</w:t>
-      </w:r>
-      <w:r>
-        <w:tab/>
-      </w:r>
-      <w:r>
-        <w:fldChar w:fldCharType="begin"/>
-      </w:r>
-      <w:r>
-        <w:instrText xml:space="preserve"> PAGEREF _Toc24649 </w:instrText>
-      </w:r>
-      <w:r>
-        <w:fldChar w:fldCharType="separate"/>
-      </w:r>
-      <w:r>
-        <w:t>8</w:t>
-      </w:r>
-      <w:r>
-        <w:fldChar w:fldCharType="end"/>
-      </w:r>
-      <w:r>
-        <w:fldChar w:fldCharType="end"/>
-      </w:r>
-    </w:p>
-    <w:p>
-      <w:pPr>
-        <w:pStyle w:val="16"/>
-        <w:keepNext w:val="0"/>
-        <w:keepLines w:val="0"/>
-        <w:pageBreakBefore w:val="0"/>
-        <w:widowControl w:val="0"/>
-        <w:tabs>
-          <w:tab w:val="right" w:leader="dot" w:pos="8504"/>
-        </w:tabs>
-        <w:kinsoku/>
-        <w:wordWrap/>
-        <w:overflowPunct/>
-        <w:topLinePunct w:val="0"/>
-        <w:autoSpaceDE/>
-        <w:autoSpaceDN/>
-        <w:bidi w:val="0"/>
-        <w:adjustRightInd/>
-        <w:snapToGrid/>
-        <w:ind w:firstLine="0" w:firstLineChars="0"/>
-        <w:textAlignment w:val="auto"/>
-      </w:pPr>
-      <w:r>
-        <w:fldChar w:fldCharType="begin"/>
-      </w:r>
-      <w:r>
-        <w:instrText xml:space="preserve"> HYPERLINK \l _Toc29966 </w:instrText>
-      </w:r>
-      <w:r>
-        <w:fldChar w:fldCharType="separate"/>
-      </w:r>
-      <w:r>
-        <w:rPr>
-          <w:rFonts w:hint="eastAsia"/>
-        </w:rPr>
-        <w:t xml:space="preserve">3.3 </w:t>
-      </w:r>
-      <w:r>
-        <w:rPr>
-          <w:rFonts w:ascii="Cambria" w:hAnsi="Cambria"/>
-        </w:rPr>
-        <w:t>III</w:t>
-      </w:r>
-      <w:r>
-        <w:rPr>
-          <w:rFonts w:hint="eastAsia"/>
-        </w:rPr>
-        <w:t>区</w:t>
-      </w:r>
-      <w:r>
-        <w:tab/>
-      </w:r>
-      <w:r>
-        <w:fldChar w:fldCharType="begin"/>
-      </w:r>
-      <w:r>
-        <w:instrText xml:space="preserve"> PAGEREF _Toc29966 </w:instrText>
-      </w:r>
-      <w:r>
-        <w:fldChar w:fldCharType="separate"/>
-      </w:r>
-      <w:r>
-        <w:t>10</w:t>
-      </w:r>
-      <w:r>
-        <w:fldChar w:fldCharType="end"/>
-      </w:r>
-      <w:r>
-        <w:fldChar w:fldCharType="end"/>
-      </w:r>
-    </w:p>
-    <w:p>
-      <w:pPr>
-        <w:pStyle w:val="15"/>
-        <w:keepNext w:val="0"/>
-        <w:keepLines w:val="0"/>
-        <w:pageBreakBefore w:val="0"/>
-        <w:widowControl w:val="0"/>
-        <w:tabs>
-          <w:tab w:val="right" w:leader="dot" w:pos="8504"/>
-        </w:tabs>
-        <w:kinsoku/>
-        <w:wordWrap/>
-        <w:overflowPunct/>
-        <w:topLinePunct w:val="0"/>
-        <w:autoSpaceDE/>
-        <w:autoSpaceDN/>
-        <w:bidi w:val="0"/>
-        <w:adjustRightInd/>
-        <w:snapToGrid/>
-        <w:ind w:firstLine="0" w:firstLineChars="0"/>
-        <w:textAlignment w:val="auto"/>
-      </w:pPr>
-      <w:r>
-        <w:fldChar w:fldCharType="begin"/>
-      </w:r>
-      <w:r>
-        <w:instrText xml:space="preserve"> HYPERLINK \l _Toc29685 </w:instrText>
-      </w:r>
-      <w:r>
-        <w:fldChar w:fldCharType="separate"/>
-      </w:r>
-      <w:r>
-        <w:rPr>
-          <w:rFonts w:hint="eastAsia"/>
-        </w:rPr>
-        <w:t>4 渗透测试结论</w:t>
-      </w:r>
-      <w:r>
-        <w:tab/>
-      </w:r>
-      <w:r>
-        <w:fldChar w:fldCharType="begin"/>
-      </w:r>
-      <w:r>
-        <w:instrText xml:space="preserve"> PAGEREF _Toc29685 </w:instrText>
-      </w:r>
-      <w:r>
-        <w:fldChar w:fldCharType="separate"/>
-      </w:r>
-      <w:r>
-        <w:t>13</w:t>
-      </w:r>
-      <w:r>
-        <w:fldChar w:fldCharType="end"/>
-      </w:r>
-      <w:r>
-        <w:fldChar w:fldCharType="end"/>
+        <w:t>右键此处选择「更新域」以生成目录</w:t>
       </w:r>
     </w:p>
     <w:p>

</xml_diff>

<commit_message>
tkt/01: report title and session labels (#01)
- Remove report_title form field and detail card; stop parsing report_title
- Keep ReportTitle column but no longer populate it; rely on reportTitle() fallback
- Rename 3.1 labels: 接入点 -> 测试设备接入点, 测试机 IP -> 测试设备 IP
- Remove 接入记录 (session.label) from 3.1 rendering
- Update scan_project form labels/placeholder
- Regenerate DOCX template and update check_structure.py required slots
- Update tests for new labels and empty ReportTitle semantics
</commit_message>
<xml_diff>
--- a/tools/docx-render/templates/project-report.docx
+++ b/tools/docx-render/templates/project-report.docx
@@ -1555,7 +1555,7 @@
           <w:rFonts w:hint="eastAsia"/>
           <w:lang w:val="en-US" w:eastAsia="zh-CN"/>
         </w:rPr>
-        <w:t>接入记录：{{ session.label }}</w:t>
+        <w:t>测试设备接入点：{{ session.access_point }}</w:t>
       </w:r>
     </w:p>
     <w:p>
@@ -1570,22 +1570,7 @@
           <w:rFonts w:hint="eastAsia"/>
           <w:lang w:val="en-US" w:eastAsia="zh-CN"/>
         </w:rPr>
-        <w:t>接入点：{{ session.access_point }}</w:t>
-      </w:r>
-    </w:p>
-    <w:p>
-      <w:pPr>
-        <w:rPr>
-          <w:rFonts w:hint="default"/>
-          <w:lang w:val="en-US" w:eastAsia="zh-CN"/>
-        </w:rPr>
-      </w:pPr>
-      <w:r>
-        <w:rPr>
-          <w:rFonts w:hint="eastAsia"/>
-          <w:lang w:val="en-US" w:eastAsia="zh-CN"/>
-        </w:rPr>
-        <w:t>测试机 IP：{{ session.tester_ip }}</w:t>
+        <w:t>测试设备 IP：{{ session.tester_ip }}</w:t>
       </w:r>
     </w:p>
     <w:p>

</xml_diff>

<commit_message>
fix(report): close field usability regressions
</commit_message>
<xml_diff>
--- a/tools/docx-render/templates/project-report.docx
+++ b/tools/docx-render/templates/project-report.docx
@@ -1764,18 +1764,29 @@
       </w:r>
     </w:p>
     <w:p>
+      <w:r>
+        <w:t>{%p for remediation_line in verification.remediation_lines %}</w:t>
+      </w:r>
+    </w:p>
+    <w:p>
       <w:pPr>
         <w:rPr>
           <w:rFonts w:hint="default"/>
           <w:lang w:val="en-US" w:eastAsia="zh-CN"/>
         </w:rPr>
+        <w:ind w:firstLineChars="200"/>
       </w:pPr>
       <w:r>
         <w:rPr>
           <w:rFonts w:hint="eastAsia"/>
           <w:lang w:val="en-US" w:eastAsia="zh-CN"/>
         </w:rPr>
-        <w:t>{{ verification.remediation }}</w:t>
+        <w:t>{{ remediation_line }}</w:t>
+      </w:r>
+    </w:p>
+    <w:p>
+      <w:r>
+        <w:t>{%p endfor %}</w:t>
       </w:r>
     </w:p>
     <w:p>
@@ -1820,7 +1831,7 @@
           <w:rFonts w:hint="eastAsia"/>
           <w:lang w:val="en-US" w:eastAsia="zh-CN"/>
         </w:rPr>
-        <w:t>{{ verification.title }}不存在证明，端口（{{ verification.ports_text }}）</w:t>
+        <w:t>{{ verification.title }}相关漏洞不存在证明，端口（{{ verification.ports_text }}）</w:t>
       </w:r>
     </w:p>
     <w:p>

</xml_diff>

<commit_message>
chore: sync local workspace updates
</commit_message>
<xml_diff>
--- a/tools/docx-render/templates/project-report.docx
+++ b/tools/docx-render/templates/project-report.docx
@@ -1539,11 +1539,6 @@
       </w:r>
     </w:p>
     <w:p>
-      <w:r>
-        <w:t>{%p for session in network_zone.sessions %}</w:t>
-      </w:r>
-    </w:p>
-    <w:p>
       <w:pPr>
         <w:rPr>
           <w:rFonts w:hint="default"/>
@@ -1555,7 +1550,7 @@
           <w:rFonts w:hint="eastAsia"/>
           <w:lang w:val="en-US" w:eastAsia="zh-CN"/>
         </w:rPr>
-        <w:t>测试设备接入点：{{ session.access_point }}</w:t>
+        <w:t>测试设备接入点：{{ network_zone.access_points_text }}</w:t>
       </w:r>
     </w:p>
     <w:p>
@@ -1570,7 +1565,7 @@
           <w:rFonts w:hint="eastAsia"/>
           <w:lang w:val="en-US" w:eastAsia="zh-CN"/>
         </w:rPr>
-        <w:t>测试设备 IP：{{ session.tester_ip }}</w:t>
+        <w:t>测试设备 IP：{{ network_zone.tester_ips_text }}</w:t>
       </w:r>
     </w:p>
     <w:p>
@@ -1585,12 +1580,12 @@
           <w:rFonts w:hint="eastAsia"/>
           <w:lang w:val="en-US" w:eastAsia="zh-CN"/>
         </w:rPr>
-        <w:t>测试范围：{{ session.targets_text }}</w:t>
-      </w:r>
-    </w:p>
-    <w:p>
-      <w:r>
-        <w:t>{%p if session.exclusions_text %}</w:t>
+        <w:t>测试范围：{{ network_zone.targets_text }}</w:t>
+      </w:r>
+    </w:p>
+    <w:p>
+      <w:r>
+        <w:t>{%p if network_zone.exclusions_text %}</w:t>
       </w:r>
     </w:p>
     <w:p>
@@ -1605,7 +1600,7 @@
           <w:rFonts w:hint="eastAsia"/>
           <w:lang w:val="en-US" w:eastAsia="zh-CN"/>
         </w:rPr>
-        <w:t>排除范围：{{ session.exclusions_text }}</w:t>
+        <w:t>排除范围：{{ network_zone.exclusions_text }}</w:t>
       </w:r>
     </w:p>
     <w:p>
@@ -1615,7 +1610,7 @@
     </w:p>
     <w:p>
       <w:r>
-        <w:t>{%p if session.notes %}</w:t>
+        <w:t>{%p if network_zone.notes_text %}</w:t>
       </w:r>
     </w:p>
     <w:p>
@@ -1630,17 +1625,12 @@
           <w:rFonts w:hint="eastAsia"/>
           <w:lang w:val="en-US" w:eastAsia="zh-CN"/>
         </w:rPr>
-        <w:t>备注：{{ session.notes }}</w:t>
+        <w:t>备注：{{ network_zone.notes_text }}</w:t>
       </w:r>
     </w:p>
     <w:p>
       <w:r>
         <w:t>{%p endif %}</w:t>
-      </w:r>
-    </w:p>
-    <w:p>
-      <w:r>
-        <w:t>{%p endfor %}</w:t>
       </w:r>
     </w:p>
     <w:p>

</xml_diff>

<commit_message>
fix: docx multi-line zone context, negative dialog evidence, and release smoke wiring
- Render zone access points, tester IPs, targets, exclusions, and notes as
  separate indented paragraphs in the DOCX template instead of a single
  newline-delimited paragraph.
- Update check_structure.py and test_render_docx.py to enforce the new
  paragraph/indent structure.
- Load existing evidence and metadata into the negative verification dialog
  and allow metadata-only updates when evidence already exists.
- Add TestUpdateVerificationNotObservedUpdatesTitleAndDescription backend
  regression.
- Use ANCHORSCAN_EXPECTED_VERSION in web-smoke to assert the footer shows
  the linked display version without a leading 'v'.
- Fix release workflow smoke to use the stripped display version and install
  required browser/sqlite dependencies before release-check.
- Mark make docx-visual as a local diagnostic only; remove it from pr-check.
- Record DOCX and workbench dialog contracts in .trellis/spec.
</commit_message>
<xml_diff>
--- a/tools/docx-render/templates/project-report.docx
+++ b/tools/docx-render/templates/project-report.docx
@@ -1550,7 +1550,12 @@
           <w:rFonts w:hint="eastAsia"/>
           <w:lang w:val="en-US" w:eastAsia="zh-CN"/>
         </w:rPr>
-        <w:t>测试设备接入点：{{ network_zone.access_points_text }}</w:t>
+        <w:t>测试设备接入点：</w:t>
+      </w:r>
+    </w:p>
+    <w:p>
+      <w:r>
+        <w:t>{%p for ap in network_zone.access_points_text.splitlines() %}</w:t>
       </w:r>
     </w:p>
     <w:p>
@@ -1559,13 +1564,19 @@
           <w:rFonts w:hint="default"/>
           <w:lang w:val="en-US" w:eastAsia="zh-CN"/>
         </w:rPr>
+        <w:ind w:leftChars="200"/>
       </w:pPr>
       <w:r>
         <w:rPr>
           <w:rFonts w:hint="eastAsia"/>
           <w:lang w:val="en-US" w:eastAsia="zh-CN"/>
         </w:rPr>
-        <w:t>测试设备 IP：{{ network_zone.tester_ips_text }}</w:t>
+        <w:t>{{ ap }}</w:t>
+      </w:r>
+    </w:p>
+    <w:p>
+      <w:r>
+        <w:t>{%p endfor %}</w:t>
       </w:r>
     </w:p>
     <w:p>
@@ -1580,12 +1591,12 @@
           <w:rFonts w:hint="eastAsia"/>
           <w:lang w:val="en-US" w:eastAsia="zh-CN"/>
         </w:rPr>
-        <w:t>测试范围：{{ network_zone.targets_text }}</w:t>
-      </w:r>
-    </w:p>
-    <w:p>
-      <w:r>
-        <w:t>{%p if network_zone.exclusions_text %}</w:t>
+        <w:t>测试设备 IP：</w:t>
+      </w:r>
+    </w:p>
+    <w:p>
+      <w:r>
+        <w:t>{%p for ip in network_zone.tester_ips_text.splitlines() %}</w:t>
       </w:r>
     </w:p>
     <w:p>
@@ -1594,23 +1605,19 @@
           <w:rFonts w:hint="default"/>
           <w:lang w:val="en-US" w:eastAsia="zh-CN"/>
         </w:rPr>
+        <w:ind w:leftChars="200"/>
       </w:pPr>
       <w:r>
         <w:rPr>
           <w:rFonts w:hint="eastAsia"/>
           <w:lang w:val="en-US" w:eastAsia="zh-CN"/>
         </w:rPr>
-        <w:t>排除范围：{{ network_zone.exclusions_text }}</w:t>
-      </w:r>
-    </w:p>
-    <w:p>
-      <w:r>
-        <w:t>{%p endif %}</w:t>
-      </w:r>
-    </w:p>
-    <w:p>
-      <w:r>
-        <w:t>{%p if network_zone.notes_text %}</w:t>
+        <w:t>{{ ip }}</w:t>
+      </w:r>
+    </w:p>
+    <w:p>
+      <w:r>
+        <w:t>{%p endfor %}</w:t>
       </w:r>
     </w:p>
     <w:p>
@@ -1625,7 +1632,130 @@
           <w:rFonts w:hint="eastAsia"/>
           <w:lang w:val="en-US" w:eastAsia="zh-CN"/>
         </w:rPr>
-        <w:t>备注：{{ network_zone.notes_text }}</w:t>
+        <w:t>测试范围：</w:t>
+      </w:r>
+    </w:p>
+    <w:p>
+      <w:r>
+        <w:t>{%p for target in network_zone.targets_text.splitlines() %}</w:t>
+      </w:r>
+    </w:p>
+    <w:p>
+      <w:pPr>
+        <w:rPr>
+          <w:rFonts w:hint="default"/>
+          <w:lang w:val="en-US" w:eastAsia="zh-CN"/>
+        </w:rPr>
+        <w:ind w:leftChars="200"/>
+      </w:pPr>
+      <w:r>
+        <w:rPr>
+          <w:rFonts w:hint="eastAsia"/>
+          <w:lang w:val="en-US" w:eastAsia="zh-CN"/>
+        </w:rPr>
+        <w:t>{{ target }}</w:t>
+      </w:r>
+    </w:p>
+    <w:p>
+      <w:r>
+        <w:t>{%p endfor %}</w:t>
+      </w:r>
+    </w:p>
+    <w:p>
+      <w:r>
+        <w:t>{%p if network_zone.exclusions_text %}</w:t>
+      </w:r>
+    </w:p>
+    <w:p>
+      <w:pPr>
+        <w:rPr>
+          <w:rFonts w:hint="default"/>
+          <w:lang w:val="en-US" w:eastAsia="zh-CN"/>
+        </w:rPr>
+      </w:pPr>
+      <w:r>
+        <w:rPr>
+          <w:rFonts w:hint="eastAsia"/>
+          <w:lang w:val="en-US" w:eastAsia="zh-CN"/>
+        </w:rPr>
+        <w:t>排除范围：</w:t>
+      </w:r>
+    </w:p>
+    <w:p>
+      <w:r>
+        <w:t>{%p for exclusion in network_zone.exclusions_text.splitlines() %}</w:t>
+      </w:r>
+    </w:p>
+    <w:p>
+      <w:pPr>
+        <w:rPr>
+          <w:rFonts w:hint="default"/>
+          <w:lang w:val="en-US" w:eastAsia="zh-CN"/>
+        </w:rPr>
+        <w:ind w:leftChars="200"/>
+      </w:pPr>
+      <w:r>
+        <w:rPr>
+          <w:rFonts w:hint="eastAsia"/>
+          <w:lang w:val="en-US" w:eastAsia="zh-CN"/>
+        </w:rPr>
+        <w:t>{{ exclusion }}</w:t>
+      </w:r>
+    </w:p>
+    <w:p>
+      <w:r>
+        <w:t>{%p endfor %}</w:t>
+      </w:r>
+    </w:p>
+    <w:p>
+      <w:r>
+        <w:t>{%p endif %}</w:t>
+      </w:r>
+    </w:p>
+    <w:p>
+      <w:r>
+        <w:t>{%p if network_zone.notes_text %}</w:t>
+      </w:r>
+    </w:p>
+    <w:p>
+      <w:pPr>
+        <w:rPr>
+          <w:rFonts w:hint="default"/>
+          <w:lang w:val="en-US" w:eastAsia="zh-CN"/>
+        </w:rPr>
+      </w:pPr>
+      <w:r>
+        <w:rPr>
+          <w:rFonts w:hint="eastAsia"/>
+          <w:lang w:val="en-US" w:eastAsia="zh-CN"/>
+        </w:rPr>
+        <w:t>备注：</w:t>
+      </w:r>
+    </w:p>
+    <w:p>
+      <w:r>
+        <w:t>{%p for note in network_zone.notes_text.splitlines() %}</w:t>
+      </w:r>
+    </w:p>
+    <w:p>
+      <w:pPr>
+        <w:rPr>
+          <w:rFonts w:hint="default"/>
+          <w:lang w:val="en-US" w:eastAsia="zh-CN"/>
+        </w:rPr>
+        <w:ind w:leftChars="200"/>
+      </w:pPr>
+      <w:r>
+        <w:rPr>
+          <w:rFonts w:hint="eastAsia"/>
+          <w:lang w:val="en-US" w:eastAsia="zh-CN"/>
+        </w:rPr>
+        <w:t>{{ note }}</w:t>
+      </w:r>
+    </w:p>
+    <w:p>
+      <w:r>
+        <w:t>{%p endfor %}</w:t>
       </w:r>
     </w:p>
     <w:p>

</xml_diff>

<commit_message>
fix: render each verification description paragraph with first-line indent
Add DescriptionLines to the DOCX context and fixture so multi-paragraph
verification descriptions are rendered as separate paragraphs, each with the
same first-line indent. Update prototype.py, check_structure.py, and
test_render_docx.py to enforce the contract.
</commit_message>
<xml_diff>
--- a/tools/docx-render/templates/project-report.docx
+++ b/tools/docx-render/templates/project-report.docx
@@ -1793,18 +1793,29 @@
       </w:r>
     </w:p>
     <w:p>
+      <w:r>
+        <w:t>{%p for para in verification.description_lines %}</w:t>
+      </w:r>
+    </w:p>
+    <w:p>
       <w:pPr>
         <w:rPr>
           <w:rFonts w:hint="default"/>
           <w:lang w:val="en-US" w:eastAsia="zh-CN"/>
         </w:rPr>
+        <w:ind w:firstLineChars="200"/>
       </w:pPr>
       <w:r>
         <w:rPr>
           <w:rFonts w:hint="eastAsia"/>
           <w:lang w:val="en-US" w:eastAsia="zh-CN"/>
         </w:rPr>
-        <w:t>{{ verification.description }}</w:t>
+        <w:t>{{ para }}</w:t>
+      </w:r>
+    </w:p>
+    <w:p>
+      <w:r>
+        <w:t>{%p endfor %}</w:t>
       </w:r>
     </w:p>
     <w:p>

</xml_diff>